<commit_message>
Auto commit (2026-10-13 20:50) — 7 changes
Claude Code 세션 종료 시 자동 커밋.

Co-Authored-By: Claude <noreply@anthropic.com>
Claude-Session: https://claude.ai/code/17806859-7bf9-459e-813e-ab1905e37167
</commit_message>
<xml_diff>
--- a/projects/36_slave_dragon_king/노예라 불린 용의 공주_피칭페이지_v1.docx
+++ b/projects/36_slave_dragon_king/노예라 불린 용의 공주_피칭페이지_v1.docx
@@ -430,8 +430,24 @@
     </w:p>
     <w:p>
       <w:pPr>
+        <w:keepNext/>
+        <w:spacing w:after="40" w:before="160" w:line="312" w:lineRule="auto"/>
+      </w:pPr>
+      <w:r>
+        <w:rPr>
+          <w:rFonts w:ascii="맑은 고딕" w:hAnsi="맑은 고딕" w:eastAsia="맑은 고딕"/>
+          <w:b/>
+          <w:color w:val="1A1A1A"/>
+          <w:sz w:val="22"/>
+        </w:rPr>
+        <w:t>왕자에서 공주로, 아버지에서 오빠 셋으로</w:t>
+      </w:r>
+    </w:p>
+    <w:p>
+      <w:pPr>
         <w:keepNext w:val="0"/>
-        <w:spacing w:after="120" w:before="0" w:line="312" w:lineRule="auto"/>
+        <w:spacing w:after="40" w:before="0" w:line="312" w:lineRule="auto"/>
+        <w:ind w:left="280"/>
       </w:pPr>
       <w:r>
         <w:rPr>
@@ -440,13 +456,14 @@
           <w:color w:val="1A1A1A"/>
           <w:sz w:val="22"/>
         </w:rPr>
-        <w:t>왕자에서 공주로, 아버지에서 오빠 셋으로: 원작은 광산 노예가 된 진짜 왕자를 아버지 한 명이 짓밟음. 우리는 용 사육장 노예가 된 진짜 공주 아이비를, 막내를 지키겠다고 피로 맹세한 오빠 셋이 짓밟음(맹세 3화 · 짓밟는 장면 4·8화). 비글루 시청자는 여성이 절대다수. 원작 히트 광고 B(3분 클라이맥스)의 핵심 대사는 "왜 아버지는 늘 가짜 편이었을까". 그래서 주인공을 공주로, 짓밟는 손과 뒤늦게 후회할 사람을 한 명에서 셋으로 바꿈.</w:t>
+        <w:t>· 원작: 광산 노예가 된 진짜 왕자를 아버지 한 명이 짓밟음.</w:t>
       </w:r>
     </w:p>
     <w:p>
       <w:pPr>
         <w:keepNext w:val="0"/>
-        <w:spacing w:after="120" w:before="0" w:line="312" w:lineRule="auto"/>
+        <w:spacing w:after="40" w:before="0" w:line="312" w:lineRule="auto"/>
+        <w:ind w:left="280"/>
       </w:pPr>
       <w:r>
         <w:rPr>
@@ -455,13 +472,14 @@
           <w:color w:val="1A1A1A"/>
           <w:sz w:val="22"/>
         </w:rPr>
-        <w:t>왕좌에서 오해로: 원작 진짜 왕자는 "투기장에서 이겨 이 목줄을 벗겠다"(원작 2화)며 스스로 싸우러 감. 우리 아이비는 왕좌를 노리지 않음. 공주님께 축복을 빌러 축제에 가고(2~3화), 자기를 때리는 어머니 사라에게 줄 과일을 챙기고(7화), 그 가족을 지키려고 바닥의 과일에 얼굴을 숙임(8화). 그 어머니가 아이비를 바꿔치기한 시녀라는 사실은 시청자만 앎(1화). 원작 광고 두 편의 정점도 왕좌가 아니라, 가족이 진짜를 몰라보고 가짜 편에서 짓밟는 장면. 그래서 이야기의 중심을 왕좌에서 오해로 옮김.</w:t>
+        <w:t>· 우리: 용 사육장 노예가 된 진짜 공주 아이비를, 막내를 지키겠다고 피로 맹세한 오빠 셋이 짓밟음(맹세 3화 · 짓밟는 장면 4·8화).</w:t>
       </w:r>
     </w:p>
     <w:p>
       <w:pPr>
         <w:keepNext w:val="0"/>
-        <w:spacing w:after="120" w:before="0" w:line="312" w:lineRule="auto"/>
+        <w:spacing w:after="40" w:before="0" w:line="312" w:lineRule="auto"/>
+        <w:ind w:left="280"/>
       </w:pPr>
       <w:r>
         <w:rPr>
@@ -470,13 +488,29 @@
           <w:color w:val="1A1A1A"/>
           <w:sz w:val="22"/>
         </w:rPr>
-        <w:t>투기장에서 생일 축제로: 원작 무대는 왕실 투기장의 결투. 우리 무대는 바네사의 스무 번째 생일 축제. 새 용의 여왕 발표, 북부 대공의 청혼, 혈통 의식이 한날 한자리(2~3화). 그날은 아이비의 스무 번째 생일이기도 함(2화·5화). 원작 광고 두 편이 모두 가족의 오해를 정점에 둬서, 결투 대신 오빠 셋과 약혼자와 가짜가 한자리에 모이는 날로 바꿈.</w:t>
+        <w:t>· 이유: 비글루 시청자는 여성이 절대다수. 원작 광고 B(3분)가 판 감정도 "왜 아버지는 늘 가짜 편이었을까"라는 서러움. 그래서 주인공을 공주로 바꾸고, 가짜 편에 서서 진짜를 짓밟다가 뒤늦게 후회할 가족을 한 명에서 셋으로 늘림.</w:t>
+      </w:r>
+    </w:p>
+    <w:p>
+      <w:pPr>
+        <w:keepNext/>
+        <w:spacing w:after="40" w:before="160" w:line="312" w:lineRule="auto"/>
+      </w:pPr>
+      <w:r>
+        <w:rPr>
+          <w:rFonts w:ascii="맑은 고딕" w:hAnsi="맑은 고딕" w:eastAsia="맑은 고딕"/>
+          <w:b/>
+          <w:color w:val="1A1A1A"/>
+          <w:sz w:val="22"/>
+        </w:rPr>
+        <w:t>왕좌에서 오해로</w:t>
       </w:r>
     </w:p>
     <w:p>
       <w:pPr>
         <w:keepNext w:val="0"/>
-        <w:spacing w:after="120" w:before="0" w:line="312" w:lineRule="auto"/>
+        <w:spacing w:after="40" w:before="0" w:line="312" w:lineRule="auto"/>
+        <w:ind w:left="280"/>
       </w:pPr>
       <w:r>
         <w:rPr>
@@ -485,7 +519,165 @@
           <w:color w:val="1A1A1A"/>
           <w:sz w:val="22"/>
         </w:rPr>
-        <w:t>약혼녀에서 북부 대공으로: 원작은 가짜의 약혼녀가 진짜에게 끌림. 우리는 바네사의 약혼자인 북부 용족 대공 웨슬리. 황금 용으로 축제 광장에 내려와 사람으로 변한 순간, 약혼녀 대신 연회장 식탁 옆의 노예 아이비를 보고 심장이 뜀(6화). 원작 광고 B의 끝 대사는 약혼녀의 "그럼 그와 함께 죽겠어요". 그 대사의 자리를 남주에게 줌.</w:t>
+        <w:t>· 원작: 진짜 왕자가 "투기장에서 이겨 이 목줄을 벗겠다"며 스스로 싸우러 감(원작 2화).</w:t>
+      </w:r>
+    </w:p>
+    <w:p>
+      <w:pPr>
+        <w:keepNext w:val="0"/>
+        <w:spacing w:after="40" w:before="0" w:line="312" w:lineRule="auto"/>
+        <w:ind w:left="280"/>
+      </w:pPr>
+      <w:r>
+        <w:rPr>
+          <w:rFonts w:ascii="맑은 고딕" w:hAnsi="맑은 고딕" w:eastAsia="맑은 고딕"/>
+          <w:b w:val="0"/>
+          <w:color w:val="1A1A1A"/>
+          <w:sz w:val="22"/>
+        </w:rPr>
+        <w:t>· 우리: 아이비는 왕좌를 노리지 않음. 공주를 축복하러 축제에 가고(2~3화), 자기를 때리는 어머니 사라에게 줄 과일을 챙기고(7화), 가족까지 화를 입는다는 협박에 바닥의 과일로 얼굴을 숙임(8화). 그 어머니가 아이비를 바꿔치기한 시녀라는 건 시청자만 앎(1화).</w:t>
+      </w:r>
+    </w:p>
+    <w:p>
+      <w:pPr>
+        <w:keepNext w:val="0"/>
+        <w:spacing w:after="40" w:before="0" w:line="312" w:lineRule="auto"/>
+        <w:ind w:left="280"/>
+      </w:pPr>
+      <w:r>
+        <w:rPr>
+          <w:rFonts w:ascii="맑은 고딕" w:hAnsi="맑은 고딕" w:eastAsia="맑은 고딕"/>
+          <w:b w:val="0"/>
+          <w:color w:val="1A1A1A"/>
+          <w:sz w:val="22"/>
+        </w:rPr>
+        <w:t>· 이유: 원작 광고 두 편의 정점도 왕좌를 되찾는 장면이 아니라, 가족이 진짜를 몰라보고 가짜 편에서 짓밟는 장면.</w:t>
+      </w:r>
+    </w:p>
+    <w:p>
+      <w:pPr>
+        <w:keepNext/>
+        <w:spacing w:after="40" w:before="160" w:line="312" w:lineRule="auto"/>
+      </w:pPr>
+      <w:r>
+        <w:rPr>
+          <w:rFonts w:ascii="맑은 고딕" w:hAnsi="맑은 고딕" w:eastAsia="맑은 고딕"/>
+          <w:b/>
+          <w:color w:val="1A1A1A"/>
+          <w:sz w:val="22"/>
+        </w:rPr>
+        <w:t>투기장 결투에서 생일 축제로</w:t>
+      </w:r>
+    </w:p>
+    <w:p>
+      <w:pPr>
+        <w:keepNext w:val="0"/>
+        <w:spacing w:after="40" w:before="0" w:line="312" w:lineRule="auto"/>
+        <w:ind w:left="280"/>
+      </w:pPr>
+      <w:r>
+        <w:rPr>
+          <w:rFonts w:ascii="맑은 고딕" w:hAnsi="맑은 고딕" w:eastAsia="맑은 고딕"/>
+          <w:b w:val="0"/>
+          <w:color w:val="1A1A1A"/>
+          <w:sz w:val="22"/>
+        </w:rPr>
+        <w:t>· 원작: 무대가 왕실 투기장의 결투.</w:t>
+      </w:r>
+    </w:p>
+    <w:p>
+      <w:pPr>
+        <w:keepNext w:val="0"/>
+        <w:spacing w:after="40" w:before="0" w:line="312" w:lineRule="auto"/>
+        <w:ind w:left="280"/>
+      </w:pPr>
+      <w:r>
+        <w:rPr>
+          <w:rFonts w:ascii="맑은 고딕" w:hAnsi="맑은 고딕" w:eastAsia="맑은 고딕"/>
+          <w:b w:val="0"/>
+          <w:color w:val="1A1A1A"/>
+          <w:sz w:val="22"/>
+        </w:rPr>
+        <w:t>· 우리: 무대가 바네사의 스무 번째 생일 축제. 새 용의 여왕 발표, 북부 대공의 청혼, 혈통 의식이 같은 날 같은 자리에서 열림(2~3화). 그날은 아이비의 스무 번째 생일이기도 함(2·5화).</w:t>
+      </w:r>
+    </w:p>
+    <w:p>
+      <w:pPr>
+        <w:keepNext w:val="0"/>
+        <w:spacing w:after="40" w:before="0" w:line="312" w:lineRule="auto"/>
+        <w:ind w:left="280"/>
+      </w:pPr>
+      <w:r>
+        <w:rPr>
+          <w:rFonts w:ascii="맑은 고딕" w:hAnsi="맑은 고딕" w:eastAsia="맑은 고딕"/>
+          <w:b w:val="0"/>
+          <w:color w:val="1A1A1A"/>
+          <w:sz w:val="22"/>
+        </w:rPr>
+        <w:t>· 이유: 오해가 터지려면 오빠 셋과 약혼자와 가짜가 진짜와 한자리에 있어야 해서, 그들이 다 모이는 날로 바꿈.</w:t>
+      </w:r>
+    </w:p>
+    <w:p>
+      <w:pPr>
+        <w:keepNext/>
+        <w:spacing w:after="40" w:before="160" w:line="312" w:lineRule="auto"/>
+      </w:pPr>
+      <w:r>
+        <w:rPr>
+          <w:rFonts w:ascii="맑은 고딕" w:hAnsi="맑은 고딕" w:eastAsia="맑은 고딕"/>
+          <w:b/>
+          <w:color w:val="1A1A1A"/>
+          <w:sz w:val="22"/>
+        </w:rPr>
+        <w:t>가짜의 약혼녀에서 가짜의 약혼자로</w:t>
+      </w:r>
+    </w:p>
+    <w:p>
+      <w:pPr>
+        <w:keepNext w:val="0"/>
+        <w:spacing w:after="40" w:before="0" w:line="312" w:lineRule="auto"/>
+        <w:ind w:left="280"/>
+      </w:pPr>
+      <w:r>
+        <w:rPr>
+          <w:rFonts w:ascii="맑은 고딕" w:hAnsi="맑은 고딕" w:eastAsia="맑은 고딕"/>
+          <w:b w:val="0"/>
+          <w:color w:val="1A1A1A"/>
+          <w:sz w:val="22"/>
+        </w:rPr>
+        <w:t>· 원작: 가짜 왕자의 약혼녀가 진짜 왕자에게 끌림.</w:t>
+      </w:r>
+    </w:p>
+    <w:p>
+      <w:pPr>
+        <w:keepNext w:val="0"/>
+        <w:spacing w:after="40" w:before="0" w:line="312" w:lineRule="auto"/>
+        <w:ind w:left="280"/>
+      </w:pPr>
+      <w:r>
+        <w:rPr>
+          <w:rFonts w:ascii="맑은 고딕" w:hAnsi="맑은 고딕" w:eastAsia="맑은 고딕"/>
+          <w:b w:val="0"/>
+          <w:color w:val="1A1A1A"/>
+          <w:sz w:val="22"/>
+        </w:rPr>
+        <w:t>· 우리: 바네사의 약혼자인 북부 용족 대공 웨슬리가 황금 용에서 사람으로 변하자마자, 약혼녀가 아니라 연회장 식탁 옆의 노예 아이비에게 끌림(6화).</w:t>
+      </w:r>
+    </w:p>
+    <w:p>
+      <w:pPr>
+        <w:keepNext w:val="0"/>
+        <w:spacing w:after="40" w:before="0" w:line="312" w:lineRule="auto"/>
+        <w:ind w:left="280"/>
+      </w:pPr>
+      <w:r>
+        <w:rPr>
+          <w:rFonts w:ascii="맑은 고딕" w:hAnsi="맑은 고딕" w:eastAsia="맑은 고딕"/>
+          <w:b w:val="0"/>
+          <w:color w:val="1A1A1A"/>
+          <w:sz w:val="22"/>
+        </w:rPr>
+        <w:t>· 이유: 주인공이 공주가 됐으니 진짜에게 끌리는 쪽도 남자 주인공이 됨. 그래서 원작 광고 B 마지막에 약혼녀가 하는 "그럼 그와 함께 죽겠어요"도 우리 광고에서는 웨슬리가 말함.</w:t>
       </w:r>
     </w:p>
     <w:p>
@@ -545,7 +737,7 @@
           <w:color w:val="1A1A1A"/>
           <w:sz w:val="22"/>
         </w:rPr>
-        <w:t>→ 원작 광고 A의 정점은 가족이 진짜를 짓누르는 컷. 그 자리에 오빠 둘과 가짜가 한꺼번에 손을 대는 8화를 정점 컷으로.</w:t>
+        <w:t>→ 원작 광고 A의 정점은 가족이 진짜를 짓누르는 컷. 우리 정점 컷도 오빠 둘과 가짜가 한꺼번에 아이비를 짓누르는 8화로.</w:t>
       </w:r>
     </w:p>
     <w:p>
@@ -590,7 +782,7 @@
           <w:color w:val="1A1A1A"/>
           <w:sz w:val="22"/>
         </w:rPr>
-        <w:t>→ 같은 자리에서 날개를 뜯는 손을 아버지에서 첫째 오빠로, 붙잡는 손을 두 오빠로, 끝 대사를 약혼녀에서 남주로 바꿈.</w:t>
+        <w:t>→ 장면 순서는 그대로 두고, 날개를 뜯는 사람은 아버지에서 첫째 오빠로, 붙잡는 사람은 두 오빠로, 마지막 대사를 하는 사람은 약혼녀에서 웨슬리로 바꿈.</w:t>
       </w:r>
     </w:p>
     <w:p>

</xml_diff>

<commit_message>
Auto commit (2026-10-13 20:51) — 2 changes
Claude Code 세션 종료 시 자동 커밋.

Co-Authored-By: Claude <noreply@anthropic.com>
</commit_message>
<xml_diff>
--- a/projects/36_slave_dragon_king/노예라 불린 용의 공주_피칭페이지_v1.docx
+++ b/projects/36_slave_dragon_king/노예라 불린 용의 공주_피칭페이지_v1.docx
@@ -472,7 +472,7 @@
           <w:color w:val="1A1A1A"/>
           <w:sz w:val="22"/>
         </w:rPr>
-        <w:t>· 우리: 용 사육장 노예가 된 진짜 공주 아이비를, 막내를 지키겠다고 피로 맹세한 오빠 셋이 짓밟음(맹세 3화 · 짓밟는 장면 4·8화).</w:t>
+        <w:t>· 우리: 용 사육장 노예가 된 진짜 공주 아이비를, 가짜 공주 바네사를 막내로 알고 지키겠다고 피로 맹세한 오빠 셋이 짓밟음(맹세 3화 · 짓밟는 장면 4·8화).</w:t>
       </w:r>
     </w:p>
     <w:p>
@@ -488,7 +488,7 @@
           <w:color w:val="1A1A1A"/>
           <w:sz w:val="22"/>
         </w:rPr>
-        <w:t>· 이유: 비글루 시청자는 여성이 절대다수. 원작 광고 B(3분)가 판 감정도 "왜 아버지는 늘 가짜 편이었을까"라는 서러움. 그래서 주인공을 공주로 바꾸고, 가짜 편에 서서 진짜를 짓밟다가 뒤늦게 후회할 가족을 한 명에서 셋으로 늘림.</w:t>
+        <w:t>· 이유: 비글루 시청자는 여성이 절대다수. 원작 광고 B(3분)도 "왜 아버지는 늘 가짜 편이었을까"라는 서러움을 앞세움. 그래서 주인공을 공주로 바꾸고, 가짜 편에 서서 진짜를 짓밟다가 뒤늦게 후회할 가족을 한 명에서 셋으로 늘림.</w:t>
       </w:r>
     </w:p>
     <w:p>
@@ -535,7 +535,7 @@
           <w:color w:val="1A1A1A"/>
           <w:sz w:val="22"/>
         </w:rPr>
-        <w:t>· 우리: 아이비는 왕좌를 노리지 않음. 공주를 축복하러 축제에 가고(2~3화), 자기를 때리는 어머니 사라에게 줄 과일을 챙기고(7화), 가족까지 화를 입는다는 협박에 바닥의 과일로 얼굴을 숙임(8화). 그 어머니가 아이비를 바꿔치기한 시녀라는 건 시청자만 앎(1화).</w:t>
+        <w:t>· 우리: 아이비는 왕좌를 노리지 않음. 공주를 축복하러 축제에 가고(2~3화), 자기를 때리는 어머니 사라에게 줄 과일을 챙기고(7화), 바네사가 가족까지 화를 입을 거라고 협박하자 바닥에 짓뭉개진 과일 쪽으로 얼굴을 숙임(8화). 그 어머니가 아이비를 바꿔치기한 시녀라는 건 시청자만 앎(1화).</w:t>
       </w:r>
     </w:p>
     <w:p>
@@ -598,7 +598,7 @@
           <w:color w:val="1A1A1A"/>
           <w:sz w:val="22"/>
         </w:rPr>
-        <w:t>· 우리: 무대가 바네사의 스무 번째 생일 축제. 새 용의 여왕 발표, 북부 대공의 청혼, 혈통 의식이 같은 날 같은 자리에서 열림(2~3화). 그날은 아이비의 스무 번째 생일이기도 함(2·5화).</w:t>
+        <w:t>· 우리: 무대가 바네사의 스무 번째 생일 축제. 새 용의 여왕 발표, 북부 대공이 바네사에게 하는 청혼, 혈통 의식이 같은 날 같은 자리에서 열림(2~3화). 그날은 아이비의 스무 번째 생일이기도 함(2·5화).</w:t>
       </w:r>
     </w:p>
     <w:p>
@@ -722,7 +722,7 @@
           <w:color w:val="1A1A1A"/>
           <w:sz w:val="22"/>
         </w:rPr>
-        <w:t>우리 광고 A: 같은 형태로 1~8화 압축. 내레이션 첫 줄은 "여왕이 죽으며 맡긴 공주를, 시녀가 제 딸과 바꿔치기했다. 20년 뒤, 둘의 생일은 같은 날이다." 원작의 반항 대사 대신 4화 아이비 "싫습니다! 공주님은 공주님이시지만, 저도 이 왕국의 합법적인 백성이에요." 정점 컷은 8화. 도미닉이 오금을 걷어차 꿇리고, 세바스찬이 웨슬리를 막고, 바네사가 구두 굽으로 손등을 짓밟으며 "먹어!" → 여왕의 반지가 빛남.</w:t>
+        <w:t>우리 광고 A: 같은 형태로 1~8화 압축. 내레이션 첫 줄은 "여왕이 죽으며 맡긴 공주를, 시녀가 제 딸과 바꿔치기했다. 20년 뒤, 둘의 생일은 같은 날이다." 원작의 반항 대사 대신 4화 아이비 "싫습니다! 공주님은 공주님이시지만, 저도 이 왕국의 합법적인 백성이에요." 정점 컷은 8화. 도미닉이 아이비의 오금을 걷어차 꿇리고, 세바스찬이 웨슬리를 막고, 바네사가 구두 굽으로 아이비의 손등을 짓밟으며 "먹어!" → 바네사 손의 여왕의 반지가 빛남.</w:t>
       </w:r>
     </w:p>
     <w:p>

</xml_diff>